<commit_message>
Remove dairy/milk — refocus on actual cargo (oil, grain, oilseeds, bulk)
Milk/dairy was an unwarranted addition from market research, not in the company
profile. Replace across deck + group strategy docx:
- Market driver: milk doubling -> oilseed crushing capacity (>5.2M t/yr, ~90 plants)
- Cargo groups: vegetable oil (bulk, food tankers, flagship), grain & oilseeds, bulk/inert
- Drop dairy source; keep oil/grain/logistics sources
Re-rendered deck (14 slides) and rebuilt image pptx.

Co-Authored-By: Claude Opus 4.8 <noreply@anthropic.com>
Claude-Session: https://claude.ai/code/session_012ZQtdF2A38HHoNEV3VKJ8F
</commit_message>
<xml_diff>
--- a/strategy/WayStar_Стратегия_группы_5лет.docx
+++ b/strategy/WayStar_Стратегия_группы_5лет.docx
@@ -718,7 +718,7 @@
                 <w:color w:val="2A3746"/>
                 <w:sz w:val="17"/>
               </w:rPr>
-              <w:t>Молоко / пищепром</w:t>
+              <w:t>Переработка масличных</w:t>
             </w:r>
           </w:p>
         </w:tc>
@@ -734,7 +734,7 @@
                 <w:color w:val="2A3746"/>
                 <w:sz w:val="17"/>
               </w:rPr>
-              <w:t>Молоко удваивается до 1,2 млн т; инвестиции в пищепром +57,7%</w:t>
+              <w:t>Мощности &gt;5,2 млн т/год (~90 заводов); рост крашинга</w:t>
             </w:r>
           </w:p>
         </w:tc>
@@ -750,7 +750,7 @@
                 <w:color w:val="2A3746"/>
                 <w:sz w:val="17"/>
               </w:rPr>
-              <w:t>Грузовая база для пищевых цистерн</w:t>
+              <w:t>Грузопоток масла наливом для пищевых цистерн</w:t>
             </w:r>
           </w:p>
         </w:tc>
@@ -1692,7 +1692,7 @@
                 <w:color w:val="2A3746"/>
                 <w:sz w:val="17"/>
               </w:rPr>
-              <w:t>Растительное масло</w:t>
+              <w:t>Растительное масло (наливом)</w:t>
             </w:r>
           </w:p>
         </w:tc>
@@ -1708,7 +1708,7 @@
                 <w:color w:val="2A3746"/>
                 <w:sz w:val="17"/>
               </w:rPr>
-              <w:t>Флагман трейдинга и логистики (наливом)</w:t>
+              <w:t>Флагман трейдинга; перевозка пищевыми цистернами</w:t>
             </w:r>
           </w:p>
         </w:tc>
@@ -1792,7 +1792,7 @@
                 <w:color w:val="2A3746"/>
                 <w:sz w:val="17"/>
               </w:rPr>
-              <w:t>Молоко и пищевые наливные</w:t>
+              <w:t>Навалочные и инертные</w:t>
             </w:r>
           </w:p>
         </w:tc>
@@ -1808,7 +1808,7 @@
                 <w:color w:val="2A3746"/>
                 <w:sz w:val="17"/>
               </w:rPr>
-              <w:t>Программа пищевых цистерн</w:t>
+              <w:t>Загрузка полувагонов</w:t>
             </w:r>
           </w:p>
         </w:tc>
@@ -1816,56 +1816,6 @@
           <w:tcPr>
             <w:tcW w:type="dxa" w:w="2268"/>
             <w:shd w:val="clear" w:fill="F1F5F9"/>
-          </w:tcPr>
-          <w:p>
-            <w:r>
-              <w:rPr>
-                <w:b w:val="0"/>
-                <w:color w:val="2A3746"/>
-                <w:sz w:val="17"/>
-              </w:rPr>
-              <w:t>удвоение молока к ~2028</w:t>
-            </w:r>
-          </w:p>
-        </w:tc>
-      </w:tr>
-      <w:tr>
-        <w:tc>
-          <w:tcPr>
-            <w:tcW w:type="dxa" w:w="2381"/>
-            <w:shd w:val="clear" w:fill="FFFFFF"/>
-          </w:tcPr>
-          <w:p>
-            <w:r>
-              <w:rPr>
-                <w:b w:val="0"/>
-                <w:color w:val="2A3746"/>
-                <w:sz w:val="17"/>
-              </w:rPr>
-              <w:t>Навалочные и инертные</w:t>
-            </w:r>
-          </w:p>
-        </w:tc>
-        <w:tc>
-          <w:tcPr>
-            <w:tcW w:type="dxa" w:w="3628"/>
-            <w:shd w:val="clear" w:fill="FFFFFF"/>
-          </w:tcPr>
-          <w:p>
-            <w:r>
-              <w:rPr>
-                <w:b w:val="0"/>
-                <w:color w:val="2A3746"/>
-                <w:sz w:val="17"/>
-              </w:rPr>
-              <w:t>Загрузка полувагонов</w:t>
-            </w:r>
-          </w:p>
-        </w:tc>
-        <w:tc>
-          <w:tcPr>
-            <w:tcW w:type="dxa" w:w="2268"/>
-            <w:shd w:val="clear" w:fill="FFFFFF"/>
           </w:tcPr>
           <w:p>
             <w:r>
@@ -4935,7 +4885,7 @@
           <w:color w:val="6B7A8D"/>
           <w:sz w:val="18"/>
         </w:rPr>
-        <w:t>Молоко и пищепром (удвоение до 1,2 млн т; инвестиции +57,7%) — DairyNews, Times of Central Asia, primeminister.kz.</w:t>
+        <w:t>Переработка масличных (мощности &gt;5,2 млн т/год, ~90 заводов; рост крашинга) — UkrAgroConsult, APK-Inform.</w:t>
       </w:r>
     </w:p>
     <w:p>

</xml_diff>

<commit_message>
Elevate grain & agri-crops trading as a co-flagship alongside oil
Trading is two flows: vegetable oil (bulk) + grain/agri-crops (wheat, barley,
flax, oilseeds). Grounded in 2025 data: harvest 25.9M t, grain+flour exports
15.3M t (+60%), 45 destination countries.
Updated across deck (market tile, divisions, where-we-play, pillar 1) and
group strategy docx (division desc, market & cargo tables, sources).
Re-rendered deck (14 slides) + rebuilt image pptx.

Co-Authored-By: Claude Opus 4.8 <noreply@anthropic.com>
Claude-Session: https://claude.ai/code/session_012ZQtdF2A38HHoNEV3VKJ8F
</commit_message>
<xml_diff>
--- a/strategy/WayStar_Стратегия_группы_5лет.docx
+++ b/strategy/WayStar_Стратегия_группы_5лет.docx
@@ -432,7 +432,7 @@
                 <w:color w:val="2A3746"/>
                 <w:sz w:val="17"/>
               </w:rPr>
-              <w:t>Растительные масла, зерновые и масличные, навалочные грузы; прямые контракты с переработчиками</w:t>
+              <w:t>Два товарных потока: растительное масло (наливом) и зерно/агрокультуры (пшеница, ячмень, лён, масличные); навалочные; прямые контракты</w:t>
             </w:r>
           </w:p>
         </w:tc>
@@ -668,7 +668,7 @@
                 <w:color w:val="2A3746"/>
                 <w:sz w:val="17"/>
               </w:rPr>
-              <w:t>Зерно и масличные</w:t>
+              <w:t>Зерно и агрокультуры</w:t>
             </w:r>
           </w:p>
         </w:tc>
@@ -684,7 +684,7 @@
                 <w:color w:val="2A3746"/>
                 <w:sz w:val="17"/>
               </w:rPr>
-              <w:t>Агроэкспорт РК $7 млрд; рост переработки</w:t>
+              <w:t>Урожай 25,9 млн т (пшеница 19,3); экспорт зерна и муки 15,3 млн т (+60%), 45 стран</w:t>
             </w:r>
           </w:p>
         </w:tc>
@@ -700,7 +700,7 @@
                 <w:color w:val="2A3746"/>
                 <w:sz w:val="17"/>
               </w:rPr>
-              <w:t>Трейдинг зерна и загрузка зерновозов</w:t>
+              <w:t>Второй флагман трейдинга; загрузка зерновозов</w:t>
             </w:r>
           </w:p>
         </w:tc>
@@ -1742,7 +1742,7 @@
                 <w:color w:val="2A3746"/>
                 <w:sz w:val="17"/>
               </w:rPr>
-              <w:t>Зерно и масличные</w:t>
+              <w:t>Зерно и агрокультуры</w:t>
             </w:r>
           </w:p>
         </w:tc>
@@ -1758,7 +1758,7 @@
                 <w:color w:val="2A3746"/>
                 <w:sz w:val="17"/>
               </w:rPr>
-              <w:t>Трейдинг + зерновозы</w:t>
+              <w:t>Трейдинг + зерновозы (пшеница, ячмень, лён, масличные)</w:t>
             </w:r>
           </w:p>
         </w:tc>
@@ -1774,7 +1774,7 @@
                 <w:color w:val="2A3746"/>
                 <w:sz w:val="17"/>
               </w:rPr>
-              <w:t>агроэкспорт $7 млрд</w:t>
+              <w:t>экспорт 15,3 млн т (+60%), 45 стран</w:t>
             </w:r>
           </w:p>
         </w:tc>
@@ -2199,7 +2199,7 @@
                 <w:color w:val="2A3746"/>
                 <w:sz w:val="17"/>
               </w:rPr>
-              <w:t>Масло, зерно, масличные; масштаб контрактов; сбыт через Актау и Дубай</w:t>
+              <w:t>Два потока — масло (наливом) и зерно/агрокультуры; масштаб контрактов; сбыт через Актау и Дубай</w:t>
             </w:r>
           </w:p>
         </w:tc>
@@ -4871,7 +4871,7 @@
           <w:color w:val="6B7A8D"/>
           <w:sz w:val="18"/>
         </w:rPr>
-        <w:t>Агроэкспорт РК $7 млрд — Astana Times.</w:t>
+        <w:t>Агроэкспорт РК $7 млрд; зерно/мука — экспорт 15,3 млн т (+60%), урожай 25,9 млн т — Astana Times, APK-Inform, Grain Union РК.</w:t>
       </w:r>
     </w:p>
     <w:p>

</xml_diff>